<commit_message>
Fase 2 (en curso): fichas de normas, bibliografia depurada y version Word
- 298 citas de normas, legislacion y metodologia verificadas en su pagina
- Se quitan de 00_base.bib las 9 claves duplicadas (rigen las revisadas)
- Capitulos 1 y 2 completos; version Word de la tesis
- Se dejan de versionar los .pyc

Co-Authored-By: Claude Opus 5.5 <noreply@anthropic.com>
Claude-Session: https://claude.ai/code/session_01UWd3SZaoXRtHrszJCf3eHZ
</commit_message>
<xml_diff>
--- a/07_Entregables/scripts/plantilla_apa.docx
+++ b/07_Entregables/scripts/plantilla_apa.docx
@@ -808,15 +808,21 @@
     <w:pPr>
       <w:keepNext/>
       <w:keepLines/>
-      <w:spacing w:before="480" w:after="0"/>
+      <w:pageBreakBefore/>
+      <w:widowControl/>
+      <w:spacing w:before="0" w:after="0" w:line="480" w:lineRule="auto"/>
+      <w:ind w:firstLine="0"/>
+      <w:jc w:val="center"/>
       <w:outlineLvl w:val="0"/>
     </w:pPr>
     <w:rPr>
-      <w:rFonts w:asciiTheme="majorHAnsi" w:eastAsiaTheme="majorEastAsia" w:hAnsiTheme="majorHAnsi" w:cstheme="majorBidi"/>
+      <w:rFonts w:ascii="Times New Roman" w:hAnsi="Times New Roman" w:cs="Times New Roman" w:eastAsia="Times New Roman"/>
       <w:b/>
       <w:bCs/>
-      <w:color w:val="4F81BD" w:themeColor="accent1"/>
-      <w:sz w:val="32"/>
+      <w:i w:val="0"/>
+      <w:caps/>
+      <w:color w:val="000000"/>
+      <w:sz w:val="24"/>
       <w:szCs w:val="32"/>
     </w:rPr>
   </w:style>
@@ -830,15 +836,21 @@
     <w:pPr>
       <w:keepNext/>
       <w:keepLines/>
-      <w:spacing w:before="200" w:after="0"/>
+      <w:pageBreakBefore w:val="0"/>
+      <w:widowControl/>
+      <w:spacing w:before="0" w:after="0" w:line="480" w:lineRule="auto"/>
+      <w:ind w:firstLine="0"/>
+      <w:jc w:val="left"/>
       <w:outlineLvl w:val="1"/>
     </w:pPr>
     <w:rPr>
-      <w:rFonts w:asciiTheme="majorHAnsi" w:eastAsiaTheme="majorEastAsia" w:hAnsiTheme="majorHAnsi" w:cstheme="majorBidi"/>
+      <w:rFonts w:ascii="Times New Roman" w:hAnsi="Times New Roman" w:cs="Times New Roman" w:eastAsia="Times New Roman"/>
       <w:b/>
       <w:bCs/>
-      <w:color w:val="4F81BD" w:themeColor="accent1"/>
-      <w:sz w:val="28"/>
+      <w:i w:val="0"/>
+      <w:caps w:val="0"/>
+      <w:color w:val="000000"/>
+      <w:sz w:val="24"/>
       <w:szCs w:val="28"/>
     </w:rPr>
   </w:style>
@@ -852,14 +864,20 @@
     <w:pPr>
       <w:keepNext/>
       <w:keepLines/>
-      <w:spacing w:before="200" w:after="0"/>
+      <w:pageBreakBefore w:val="0"/>
+      <w:widowControl/>
+      <w:spacing w:before="0" w:after="0" w:line="480" w:lineRule="auto"/>
+      <w:ind w:firstLine="0"/>
+      <w:jc w:val="left"/>
       <w:outlineLvl w:val="2"/>
     </w:pPr>
     <w:rPr>
-      <w:rFonts w:asciiTheme="majorHAnsi" w:eastAsiaTheme="majorEastAsia" w:hAnsiTheme="majorHAnsi" w:cstheme="majorBidi"/>
+      <w:rFonts w:ascii="Times New Roman" w:hAnsi="Times New Roman" w:cs="Times New Roman" w:eastAsia="Times New Roman"/>
       <w:b/>
       <w:bCs/>
-      <w:color w:val="4F81BD" w:themeColor="accent1"/>
+      <w:i/>
+      <w:caps w:val="0"/>
+      <w:color w:val="000000"/>
       <w:sz w:val="24"/>
       <w:szCs w:val="24"/>
     </w:rPr>
@@ -874,14 +892,20 @@
     <w:pPr>
       <w:keepNext/>
       <w:keepLines/>
-      <w:spacing w:before="200" w:after="0"/>
+      <w:pageBreakBefore w:val="0"/>
+      <w:widowControl/>
+      <w:spacing w:before="0" w:after="0" w:line="480" w:lineRule="auto"/>
+      <w:ind w:left="0" w:firstLine="720"/>
+      <w:jc w:val="left"/>
       <w:outlineLvl w:val="3"/>
     </w:pPr>
     <w:rPr>
-      <w:rFonts w:asciiTheme="majorHAnsi" w:eastAsiaTheme="majorEastAsia" w:hAnsiTheme="majorHAnsi" w:cstheme="majorBidi"/>
-      <w:i/>
+      <w:rFonts w:ascii="Times New Roman" w:hAnsi="Times New Roman" w:cs="Times New Roman" w:eastAsia="Times New Roman"/>
+      <w:i w:val="0"/>
+      <w:b/>
       <w:bCs/>
-      <w:color w:val="4F81BD" w:themeColor="accent1"/>
+      <w:caps w:val="0"/>
+      <w:color w:val="000000"/>
       <w:sz w:val="24"/>
       <w:szCs w:val="24"/>
     </w:rPr>
@@ -896,13 +920,20 @@
     <w:pPr>
       <w:keepNext/>
       <w:keepLines/>
-      <w:spacing w:before="200" w:after="0"/>
+      <w:pageBreakBefore w:val="0"/>
+      <w:widowControl/>
+      <w:spacing w:before="0" w:after="0" w:line="480" w:lineRule="auto"/>
+      <w:ind w:left="0" w:firstLine="720"/>
+      <w:jc w:val="left"/>
       <w:outlineLvl w:val="4"/>
     </w:pPr>
     <w:rPr>
-      <w:rFonts w:asciiTheme="majorHAnsi" w:eastAsiaTheme="majorEastAsia" w:hAnsiTheme="majorHAnsi" w:cstheme="majorBidi"/>
+      <w:rFonts w:ascii="Times New Roman" w:hAnsi="Times New Roman" w:cs="Times New Roman" w:eastAsia="Times New Roman"/>
+      <w:b/>
+      <w:i/>
       <w:iCs/>
-      <w:color w:val="4F81BD" w:themeColor="accent1"/>
+      <w:caps w:val="0"/>
+      <w:color w:val="000000"/>
       <w:sz w:val="24"/>
       <w:szCs w:val="24"/>
     </w:rPr>
@@ -917,12 +948,19 @@
     <w:pPr>
       <w:keepNext/>
       <w:keepLines/>
-      <w:spacing w:before="200" w:after="0"/>
+      <w:pageBreakBefore w:val="0"/>
+      <w:widowControl/>
+      <w:spacing w:before="0" w:after="0" w:line="480" w:lineRule="auto"/>
+      <w:ind w:left="0" w:firstLine="720"/>
+      <w:jc w:val="left"/>
       <w:outlineLvl w:val="5"/>
     </w:pPr>
     <w:rPr>
-      <w:rFonts w:asciiTheme="majorHAnsi" w:eastAsiaTheme="majorEastAsia" w:hAnsiTheme="majorHAnsi" w:cstheme="majorBidi"/>
-      <w:color w:val="4F81BD" w:themeColor="accent1"/>
+      <w:rFonts w:ascii="Times New Roman" w:hAnsi="Times New Roman" w:cs="Times New Roman" w:eastAsia="Times New Roman"/>
+      <w:b/>
+      <w:i/>
+      <w:caps w:val="0"/>
+      <w:color w:val="000000"/>
       <w:sz w:val="24"/>
       <w:szCs w:val="24"/>
     </w:rPr>
@@ -937,12 +975,19 @@
     <w:pPr>
       <w:keepNext/>
       <w:keepLines/>
-      <w:spacing w:before="200" w:after="0"/>
+      <w:pageBreakBefore w:val="0"/>
+      <w:widowControl/>
+      <w:spacing w:before="0" w:after="0" w:line="480" w:lineRule="auto"/>
+      <w:ind w:left="0" w:firstLine="720"/>
+      <w:jc w:val="left"/>
       <w:outlineLvl w:val="6"/>
     </w:pPr>
     <w:rPr>
-      <w:rFonts w:asciiTheme="majorHAnsi" w:eastAsiaTheme="majorEastAsia" w:hAnsiTheme="majorHAnsi" w:cstheme="majorBidi"/>
-      <w:color w:val="4F81BD" w:themeColor="accent1"/>
+      <w:rFonts w:ascii="Times New Roman" w:hAnsi="Times New Roman" w:cs="Times New Roman" w:eastAsia="Times New Roman"/>
+      <w:b/>
+      <w:i/>
+      <w:caps w:val="0"/>
+      <w:color w:val="000000"/>
       <w:sz w:val="24"/>
       <w:szCs w:val="24"/>
     </w:rPr>
@@ -957,12 +1002,19 @@
     <w:pPr>
       <w:keepNext/>
       <w:keepLines/>
-      <w:spacing w:before="200" w:after="0"/>
+      <w:pageBreakBefore w:val="0"/>
+      <w:widowControl/>
+      <w:spacing w:before="0" w:after="0" w:line="480" w:lineRule="auto"/>
+      <w:ind w:left="0" w:firstLine="720"/>
+      <w:jc w:val="left"/>
       <w:outlineLvl w:val="7"/>
     </w:pPr>
     <w:rPr>
-      <w:rFonts w:asciiTheme="majorHAnsi" w:eastAsiaTheme="majorEastAsia" w:hAnsiTheme="majorHAnsi" w:cstheme="majorBidi"/>
-      <w:color w:val="4F81BD" w:themeColor="accent1"/>
+      <w:rFonts w:ascii="Times New Roman" w:hAnsi="Times New Roman" w:cs="Times New Roman" w:eastAsia="Times New Roman"/>
+      <w:b/>
+      <w:i/>
+      <w:caps w:val="0"/>
+      <w:color w:val="000000"/>
       <w:sz w:val="24"/>
       <w:szCs w:val="24"/>
     </w:rPr>
@@ -977,12 +1029,19 @@
     <w:pPr>
       <w:keepNext/>
       <w:keepLines/>
-      <w:spacing w:before="200" w:after="0"/>
+      <w:pageBreakBefore w:val="0"/>
+      <w:widowControl/>
+      <w:spacing w:before="0" w:after="0" w:line="480" w:lineRule="auto"/>
+      <w:ind w:left="0" w:firstLine="720"/>
+      <w:jc w:val="left"/>
       <w:outlineLvl w:val="8"/>
     </w:pPr>
     <w:rPr>
-      <w:rFonts w:asciiTheme="majorHAnsi" w:eastAsiaTheme="majorEastAsia" w:hAnsiTheme="majorHAnsi" w:cstheme="majorBidi"/>
-      <w:color w:val="4F81BD" w:themeColor="accent1"/>
+      <w:rFonts w:ascii="Times New Roman" w:hAnsi="Times New Roman" w:cs="Times New Roman" w:eastAsia="Times New Roman"/>
+      <w:b/>
+      <w:i/>
+      <w:caps w:val="0"/>
+      <w:color w:val="000000"/>
       <w:sz w:val="24"/>
       <w:szCs w:val="24"/>
     </w:rPr>
@@ -1221,195 +1280,6 @@
       <w:bCs w:val="0"/>
       <w:i w:val="0"/>
       <w:caps/>
-      <w:color w:val="000000"/>
-      <w:sz w:val="24"/>
-    </w:rPr>
-  </w:style>
-  <w:style w:type="paragraph" w:customStyle="1" w:styleId="Heading1">
-    <w:name w:val="heading 1"/>
-    <w:basedOn w:val="Normal"/>
-    <w:pPr>
-      <w:keepNext/>
-      <w:pageBreakBefore/>
-      <w:widowControl/>
-      <w:spacing w:line="480" w:lineRule="auto" w:before="0" w:after="0"/>
-      <w:ind w:firstLine="0"/>
-      <w:jc w:val="center"/>
-      <w:outlineLvl w:val="0"/>
-    </w:pPr>
-    <w:rPr>
-      <w:rFonts w:ascii="Times New Roman" w:hAnsi="Times New Roman" w:cs="Times New Roman" w:eastAsia="Times New Roman"/>
-      <w:b/>
-      <w:i w:val="0"/>
-      <w:caps/>
-      <w:color w:val="000000"/>
-      <w:sz w:val="24"/>
-    </w:rPr>
-  </w:style>
-  <w:style w:type="paragraph" w:customStyle="1" w:styleId="Heading2">
-    <w:name w:val="heading 2"/>
-    <w:basedOn w:val="Normal"/>
-    <w:pPr>
-      <w:keepNext/>
-      <w:pageBreakBefore w:val="0"/>
-      <w:widowControl/>
-      <w:spacing w:line="480" w:lineRule="auto" w:before="0" w:after="0"/>
-      <w:ind w:firstLine="0"/>
-      <w:jc w:val="left"/>
-      <w:outlineLvl w:val="1"/>
-    </w:pPr>
-    <w:rPr>
-      <w:rFonts w:ascii="Times New Roman" w:hAnsi="Times New Roman" w:cs="Times New Roman" w:eastAsia="Times New Roman"/>
-      <w:b/>
-      <w:i w:val="0"/>
-      <w:caps w:val="0"/>
-      <w:color w:val="000000"/>
-      <w:sz w:val="24"/>
-    </w:rPr>
-  </w:style>
-  <w:style w:type="paragraph" w:customStyle="1" w:styleId="Heading3">
-    <w:name w:val="heading 3"/>
-    <w:basedOn w:val="Normal"/>
-    <w:pPr>
-      <w:keepNext/>
-      <w:pageBreakBefore w:val="0"/>
-      <w:widowControl/>
-      <w:spacing w:line="480" w:lineRule="auto" w:before="0" w:after="0"/>
-      <w:ind w:firstLine="0"/>
-      <w:jc w:val="left"/>
-      <w:outlineLvl w:val="2"/>
-    </w:pPr>
-    <w:rPr>
-      <w:rFonts w:ascii="Times New Roman" w:hAnsi="Times New Roman" w:cs="Times New Roman" w:eastAsia="Times New Roman"/>
-      <w:b/>
-      <w:i/>
-      <w:caps w:val="0"/>
-      <w:color w:val="000000"/>
-      <w:sz w:val="24"/>
-    </w:rPr>
-  </w:style>
-  <w:style w:type="paragraph" w:customStyle="1" w:styleId="Heading4">
-    <w:name w:val="heading 4"/>
-    <w:basedOn w:val="Normal"/>
-    <w:pPr>
-      <w:keepNext/>
-      <w:pageBreakBefore w:val="0"/>
-      <w:widowControl/>
-      <w:spacing w:line="480" w:lineRule="auto" w:before="0" w:after="0"/>
-      <w:ind w:left="0" w:firstLine="720"/>
-      <w:jc w:val="left"/>
-      <w:outlineLvl w:val="3"/>
-    </w:pPr>
-    <w:rPr>
-      <w:rFonts w:ascii="Times New Roman" w:hAnsi="Times New Roman" w:cs="Times New Roman" w:eastAsia="Times New Roman"/>
-      <w:b/>
-      <w:i w:val="0"/>
-      <w:caps w:val="0"/>
-      <w:color w:val="000000"/>
-      <w:sz w:val="24"/>
-    </w:rPr>
-  </w:style>
-  <w:style w:type="paragraph" w:customStyle="1" w:styleId="Heading5">
-    <w:name w:val="heading 5"/>
-    <w:basedOn w:val="Normal"/>
-    <w:pPr>
-      <w:keepNext/>
-      <w:pageBreakBefore w:val="0"/>
-      <w:widowControl/>
-      <w:spacing w:line="480" w:lineRule="auto" w:before="0" w:after="0"/>
-      <w:ind w:left="0" w:firstLine="720"/>
-      <w:jc w:val="left"/>
-      <w:outlineLvl w:val="4"/>
-    </w:pPr>
-    <w:rPr>
-      <w:rFonts w:ascii="Times New Roman" w:hAnsi="Times New Roman" w:cs="Times New Roman" w:eastAsia="Times New Roman"/>
-      <w:b/>
-      <w:i/>
-      <w:caps w:val="0"/>
-      <w:color w:val="000000"/>
-      <w:sz w:val="24"/>
-    </w:rPr>
-  </w:style>
-  <w:style w:type="paragraph" w:customStyle="1" w:styleId="Heading6">
-    <w:name w:val="heading 6"/>
-    <w:basedOn w:val="Normal"/>
-    <w:pPr>
-      <w:keepNext/>
-      <w:pageBreakBefore w:val="0"/>
-      <w:widowControl/>
-      <w:spacing w:line="480" w:lineRule="auto" w:before="0" w:after="0"/>
-      <w:ind w:left="0" w:firstLine="720"/>
-      <w:jc w:val="left"/>
-      <w:outlineLvl w:val="5"/>
-    </w:pPr>
-    <w:rPr>
-      <w:rFonts w:ascii="Times New Roman" w:hAnsi="Times New Roman" w:cs="Times New Roman" w:eastAsia="Times New Roman"/>
-      <w:b/>
-      <w:i/>
-      <w:caps w:val="0"/>
-      <w:color w:val="000000"/>
-      <w:sz w:val="24"/>
-    </w:rPr>
-  </w:style>
-  <w:style w:type="paragraph" w:customStyle="1" w:styleId="Heading7">
-    <w:name w:val="heading 7"/>
-    <w:basedOn w:val="Normal"/>
-    <w:pPr>
-      <w:keepNext/>
-      <w:pageBreakBefore w:val="0"/>
-      <w:widowControl/>
-      <w:spacing w:line="480" w:lineRule="auto" w:before="0" w:after="0"/>
-      <w:ind w:left="0" w:firstLine="720"/>
-      <w:jc w:val="left"/>
-      <w:outlineLvl w:val="6"/>
-    </w:pPr>
-    <w:rPr>
-      <w:rFonts w:ascii="Times New Roman" w:hAnsi="Times New Roman" w:cs="Times New Roman" w:eastAsia="Times New Roman"/>
-      <w:b/>
-      <w:i/>
-      <w:caps w:val="0"/>
-      <w:color w:val="000000"/>
-      <w:sz w:val="24"/>
-    </w:rPr>
-  </w:style>
-  <w:style w:type="paragraph" w:customStyle="1" w:styleId="Heading8">
-    <w:name w:val="heading 8"/>
-    <w:basedOn w:val="Normal"/>
-    <w:pPr>
-      <w:keepNext/>
-      <w:pageBreakBefore w:val="0"/>
-      <w:widowControl/>
-      <w:spacing w:line="480" w:lineRule="auto" w:before="0" w:after="0"/>
-      <w:ind w:left="0" w:firstLine="720"/>
-      <w:jc w:val="left"/>
-      <w:outlineLvl w:val="7"/>
-    </w:pPr>
-    <w:rPr>
-      <w:rFonts w:ascii="Times New Roman" w:hAnsi="Times New Roman" w:cs="Times New Roman" w:eastAsia="Times New Roman"/>
-      <w:b/>
-      <w:i/>
-      <w:caps w:val="0"/>
-      <w:color w:val="000000"/>
-      <w:sz w:val="24"/>
-    </w:rPr>
-  </w:style>
-  <w:style w:type="paragraph" w:customStyle="1" w:styleId="Heading9">
-    <w:name w:val="heading 9"/>
-    <w:basedOn w:val="Normal"/>
-    <w:pPr>
-      <w:keepNext/>
-      <w:pageBreakBefore w:val="0"/>
-      <w:widowControl/>
-      <w:spacing w:line="480" w:lineRule="auto" w:before="0" w:after="0"/>
-      <w:ind w:left="0" w:firstLine="720"/>
-      <w:jc w:val="left"/>
-      <w:outlineLvl w:val="8"/>
-    </w:pPr>
-    <w:rPr>
-      <w:rFonts w:ascii="Times New Roman" w:hAnsi="Times New Roman" w:cs="Times New Roman" w:eastAsia="Times New Roman"/>
-      <w:b/>
-      <w:i/>
-      <w:caps w:val="0"/>
       <w:color w:val="000000"/>
       <w:sz w:val="24"/>
     </w:rPr>

</xml_diff>